<commit_message>
Add coverpage to exported exams
 - Rewrites the cover page default format function
 - Modifies the default cover page template
 - Inserts the generated cover page at the start of the exam
</commit_message>
<xml_diff>
--- a/Server/src/fileExporters/coverpageTemplate.docx
+++ b/Server/src/fileExporters/coverpageTemplate.docx
@@ -124,7 +124,18 @@
                 <w14:ligatures w14:val="none"/>
               </w:rPr>
               <w:tab/>
-              <w:t>{semester}</w:t>
+            </w:r>
+            <w:r>
+              <w:rPr>
+                <w:rFonts w:ascii="Times New Roman" w:eastAsia="Times New Roman" w:hAnsi="Times New Roman" w:cs="Times New Roman"/>
+                <w:b/>
+                <w:kern w:val="0"/>
+                <w:sz w:val="24"/>
+                <w:szCs w:val="24"/>
+                <w:lang w:val="en-AU"/>
+                <w14:ligatures w14:val="none"/>
+              </w:rPr>
+              <w:t>semester</w:t>
             </w:r>
           </w:p>
           <w:p>
@@ -151,7 +162,7 @@
                 <w:lang w:val="en-AU"/>
                 <w14:ligatures w14:val="none"/>
               </w:rPr>
-              <w:t>{campus}</w:t>
+              <w:t>campus</w:t>
             </w:r>
           </w:p>
           <w:p>
@@ -251,7 +262,7 @@
           <w:lang w:val="en-AU"/>
           <w14:ligatures w14:val="none"/>
         </w:rPr>
-        <w:t>{department}</w:t>
+        <w:t>department</w:t>
       </w:r>
     </w:p>
     <w:p>
@@ -307,6 +318,7 @@
           <w14:ligatures w14:val="none"/>
         </w:rPr>
       </w:pPr>
+      <w:proofErr w:type="spellStart"/>
       <w:r>
         <w:rPr>
           <w:rFonts w:ascii="Times New Roman" w:eastAsia="Times New Roman" w:hAnsi="Times New Roman" w:cs="Times New Roman"/>
@@ -318,75 +330,9 @@
           <w:lang w:val="en-AU"/>
           <w14:ligatures w14:val="none"/>
         </w:rPr>
-        <w:t>{</w:t>
-      </w:r>
-      <w:proofErr w:type="spellStart"/>
-      <w:r>
-        <w:rPr>
-          <w:rFonts w:ascii="Times New Roman" w:eastAsia="Times New Roman" w:hAnsi="Times New Roman" w:cs="Times New Roman"/>
-          <w:b/>
-          <w:color w:val="000000"/>
-          <w:kern w:val="0"/>
-          <w:sz w:val="24"/>
-          <w:szCs w:val="24"/>
-          <w:lang w:val="en-AU"/>
-          <w14:ligatures w14:val="none"/>
-        </w:rPr>
-        <w:t>course</w:t>
-      </w:r>
-      <w:r>
-        <w:rPr>
-          <w:rFonts w:ascii="Times New Roman" w:eastAsia="Times New Roman" w:hAnsi="Times New Roman" w:cs="Times New Roman"/>
-          <w:b/>
-          <w:color w:val="000000"/>
-          <w:kern w:val="0"/>
-          <w:sz w:val="24"/>
-          <w:szCs w:val="24"/>
-          <w:lang w:val="en-AU"/>
-          <w14:ligatures w14:val="none"/>
-        </w:rPr>
-        <w:t>C</w:t>
-      </w:r>
-      <w:r>
-        <w:rPr>
-          <w:rFonts w:ascii="Times New Roman" w:eastAsia="Times New Roman" w:hAnsi="Times New Roman" w:cs="Times New Roman"/>
-          <w:b/>
-          <w:color w:val="000000"/>
-          <w:kern w:val="0"/>
-          <w:sz w:val="24"/>
-          <w:szCs w:val="24"/>
-          <w:lang w:val="en-AU"/>
-          <w14:ligatures w14:val="none"/>
-        </w:rPr>
-        <w:t>od</w:t>
-      </w:r>
-      <w:r>
-        <w:rPr>
-          <w:rFonts w:ascii="Times New Roman" w:eastAsia="Times New Roman" w:hAnsi="Times New Roman" w:cs="Times New Roman"/>
-          <w:b/>
-          <w:color w:val="000000"/>
-          <w:kern w:val="0"/>
-          <w:sz w:val="24"/>
-          <w:szCs w:val="24"/>
-          <w:lang w:val="en-AU"/>
-          <w14:ligatures w14:val="none"/>
-        </w:rPr>
-        <w:t>e</w:t>
+        <w:t>courseCode</w:t>
       </w:r>
       <w:proofErr w:type="spellEnd"/>
-      <w:r>
-        <w:rPr>
-          <w:rFonts w:ascii="Times New Roman" w:eastAsia="Times New Roman" w:hAnsi="Times New Roman" w:cs="Times New Roman"/>
-          <w:b/>
-          <w:color w:val="000000"/>
-          <w:kern w:val="0"/>
-          <w:sz w:val="24"/>
-          <w:szCs w:val="24"/>
-          <w:lang w:val="en-AU"/>
-          <w14:ligatures w14:val="none"/>
-        </w:rPr>
-        <w:t>}</w:t>
-      </w:r>
     </w:p>
     <w:p>
       <w:pPr>
@@ -414,6 +360,7 @@
           <w14:ligatures w14:val="none"/>
         </w:rPr>
       </w:pPr>
+      <w:proofErr w:type="spellStart"/>
       <w:r>
         <w:rPr>
           <w:rFonts w:ascii="Times New Roman" w:eastAsia="Times New Roman" w:hAnsi="Times New Roman" w:cs="Times New Roman"/>
@@ -425,62 +372,9 @@
           <w:lang w:val="en-AU"/>
           <w14:ligatures w14:val="none"/>
         </w:rPr>
-        <w:t>{</w:t>
-      </w:r>
-      <w:proofErr w:type="spellStart"/>
-      <w:r>
-        <w:rPr>
-          <w:rFonts w:ascii="Times New Roman" w:eastAsia="Times New Roman" w:hAnsi="Times New Roman" w:cs="Times New Roman"/>
-          <w:b/>
-          <w:color w:val="000000"/>
-          <w:kern w:val="0"/>
-          <w:sz w:val="24"/>
-          <w:szCs w:val="24"/>
-          <w:lang w:val="en-AU"/>
-          <w14:ligatures w14:val="none"/>
-        </w:rPr>
-        <w:t>exam</w:t>
-      </w:r>
-      <w:r>
-        <w:rPr>
-          <w:rFonts w:ascii="Times New Roman" w:eastAsia="Times New Roman" w:hAnsi="Times New Roman" w:cs="Times New Roman"/>
-          <w:b/>
-          <w:color w:val="000000"/>
-          <w:kern w:val="0"/>
-          <w:sz w:val="24"/>
-          <w:szCs w:val="24"/>
-          <w:lang w:val="en-AU"/>
-          <w14:ligatures w14:val="none"/>
-        </w:rPr>
-        <w:t>T</w:t>
-      </w:r>
-      <w:r>
-        <w:rPr>
-          <w:rFonts w:ascii="Times New Roman" w:eastAsia="Times New Roman" w:hAnsi="Times New Roman" w:cs="Times New Roman"/>
-          <w:b/>
-          <w:color w:val="000000"/>
-          <w:kern w:val="0"/>
-          <w:sz w:val="24"/>
-          <w:szCs w:val="24"/>
-          <w:lang w:val="en-AU"/>
-          <w14:ligatures w14:val="none"/>
-        </w:rPr>
-        <w:t>itle</w:t>
+        <w:t>examTitle</w:t>
       </w:r>
       <w:proofErr w:type="spellEnd"/>
-      <w:r>
-        <w:rPr>
-          <w:rFonts w:ascii="Times New Roman" w:eastAsia="Times New Roman" w:hAnsi="Times New Roman" w:cs="Times New Roman"/>
-          <w:b/>
-          <w:color w:val="000000"/>
-          <w:kern w:val="0"/>
-          <w:sz w:val="24"/>
-          <w:szCs w:val="24"/>
-          <w:lang w:val="en-AU"/>
-          <w14:ligatures w14:val="none"/>
-        </w:rPr>
-        <w:t>}</w:t>
-      </w:r>
     </w:p>
     <w:p>
       <w:pPr>
@@ -560,7 +454,7 @@
           <w:lang w:val="en-AU"/>
           <w14:ligatures w14:val="none"/>
         </w:rPr>
-        <w:t>{duration}</w:t>
+        <w:t>duration</w:t>
       </w:r>
     </w:p>
     <w:p>
@@ -683,17 +577,6 @@
           <w14:ligatures w14:val="none"/>
         </w:rPr>
       </w:pPr>
-      <w:r>
-        <w:rPr>
-          <w:rFonts w:ascii="Times New Roman" w:eastAsia="Times New Roman" w:hAnsi="Times New Roman" w:cs="Times New Roman"/>
-          <w:kern w:val="0"/>
-          <w:sz w:val="24"/>
-          <w:szCs w:val="24"/>
-          <w:lang w:val="en-AU"/>
-          <w14:ligatures w14:val="none"/>
-        </w:rPr>
-        <w:t>{</w:t>
-      </w:r>
       <w:proofErr w:type="spellStart"/>
       <w:r>
         <w:rPr>
@@ -704,29 +587,7 @@
           <w:lang w:val="en-AU"/>
           <w14:ligatures w14:val="none"/>
         </w:rPr>
-        <w:t>note</w:t>
-      </w:r>
-      <w:r>
-        <w:rPr>
-          <w:rFonts w:ascii="Times New Roman" w:eastAsia="Times New Roman" w:hAnsi="Times New Roman" w:cs="Times New Roman"/>
-          <w:kern w:val="0"/>
-          <w:sz w:val="24"/>
-          <w:szCs w:val="24"/>
-          <w:lang w:val="en-AU"/>
-          <w14:ligatures w14:val="none"/>
-        </w:rPr>
-        <w:t>C</w:t>
-      </w:r>
-      <w:r>
-        <w:rPr>
-          <w:rFonts w:ascii="Times New Roman" w:eastAsia="Times New Roman" w:hAnsi="Times New Roman" w:cs="Times New Roman"/>
-          <w:kern w:val="0"/>
-          <w:sz w:val="24"/>
-          <w:szCs w:val="24"/>
-          <w:lang w:val="en-AU"/>
-          <w14:ligatures w14:val="none"/>
-        </w:rPr>
-        <w:t>ontent</w:t>
+        <w:t>noteContent</w:t>
       </w:r>
       <w:proofErr w:type="spellEnd"/>
       <w:r>
@@ -738,21 +599,21 @@
           <w:lang w:val="en-AU"/>
           <w14:ligatures w14:val="none"/>
         </w:rPr>
-        <w:t>}</w:t>
-      </w:r>
-      <w:r>
-        <w:rPr>
-          <w:rFonts w:ascii="Times New Roman" w:eastAsia="Times New Roman" w:hAnsi="Times New Roman" w:cs="Times New Roman"/>
-          <w:kern w:val="0"/>
-          <w:sz w:val="24"/>
-          <w:szCs w:val="24"/>
-          <w:lang w:val="en-AU"/>
-          <w14:ligatures w14:val="none"/>
-        </w:rPr>
         <w:t>.</w:t>
       </w:r>
     </w:p>
     <w:p/>
+    <w:p/>
+    <w:p>
+      <w:pPr>
+        <w:tabs>
+          <w:tab w:val="left" w:pos="5790"/>
+        </w:tabs>
+      </w:pPr>
+      <w:r>
+        <w:tab/>
+      </w:r>
+    </w:p>
     <w:sectPr>
       <w:headerReference w:type="default" r:id="rId6"/>
       <w:pgSz w:w="11906" w:h="16838"/>
@@ -864,7 +725,7 @@
         <w:lang w:val="en-AU"/>
         <w14:ligatures w14:val="none"/>
       </w:rPr>
-      <w:t xml:space="preserve"> {</w:t>
+      <w:t xml:space="preserve"> </w:t>
     </w:r>
     <w:proofErr w:type="spellStart"/>
     <w:r>
@@ -877,45 +738,9 @@
         <w:lang w:val="en-AU"/>
         <w14:ligatures w14:val="none"/>
       </w:rPr>
-      <w:t>version</w:t>
-    </w:r>
-    <w:r>
-      <w:rPr>
-        <w:rFonts w:ascii="Times New Roman" w:eastAsia="Times New Roman" w:hAnsi="Times New Roman" w:cs="Times New Roman"/>
-        <w:color w:val="000000"/>
-        <w:kern w:val="0"/>
-        <w:sz w:val="24"/>
-        <w:szCs w:val="24"/>
-        <w:lang w:val="en-AU"/>
-        <w14:ligatures w14:val="none"/>
-      </w:rPr>
-      <w:t>N</w:t>
-    </w:r>
-    <w:r>
-      <w:rPr>
-        <w:rFonts w:ascii="Times New Roman" w:eastAsia="Times New Roman" w:hAnsi="Times New Roman" w:cs="Times New Roman"/>
-        <w:color w:val="000000"/>
-        <w:kern w:val="0"/>
-        <w:sz w:val="24"/>
-        <w:szCs w:val="24"/>
-        <w:lang w:val="en-AU"/>
-        <w14:ligatures w14:val="none"/>
-      </w:rPr>
-      <w:t>umber</w:t>
+      <w:t>versionNumber</w:t>
     </w:r>
     <w:proofErr w:type="spellEnd"/>
-    <w:r>
-      <w:rPr>
-        <w:rFonts w:ascii="Times New Roman" w:eastAsia="Times New Roman" w:hAnsi="Times New Roman" w:cs="Times New Roman"/>
-        <w:color w:val="000000"/>
-        <w:kern w:val="0"/>
-        <w:sz w:val="24"/>
-        <w:szCs w:val="24"/>
-        <w:lang w:val="en-AU"/>
-        <w14:ligatures w14:val="none"/>
-      </w:rPr>
-      <w:t>}</w:t>
-    </w:r>
     <w:r>
       <w:rPr>
         <w:rFonts w:ascii="Times New Roman" w:eastAsia="Times New Roman" w:hAnsi="Times New Roman" w:cs="Times New Roman"/>
@@ -940,18 +765,6 @@
       </w:rPr>
       <w:tab/>
     </w:r>
-    <w:r>
-      <w:rPr>
-        <w:rFonts w:ascii="Times New Roman" w:eastAsia="Times New Roman" w:hAnsi="Times New Roman" w:cs="Times New Roman"/>
-        <w:color w:val="000000"/>
-        <w:kern w:val="0"/>
-        <w:sz w:val="24"/>
-        <w:szCs w:val="24"/>
-        <w:lang w:val="en-AU"/>
-        <w14:ligatures w14:val="none"/>
-      </w:rPr>
-      <w:t>{</w:t>
-    </w:r>
     <w:proofErr w:type="spellStart"/>
     <w:r>
       <w:rPr>
@@ -963,45 +776,9 @@
         <w:lang w:val="en-AU"/>
         <w14:ligatures w14:val="none"/>
       </w:rPr>
-      <w:t>course</w:t>
-    </w:r>
-    <w:r>
-      <w:rPr>
-        <w:rFonts w:ascii="Times New Roman" w:eastAsia="Times New Roman" w:hAnsi="Times New Roman" w:cs="Times New Roman"/>
-        <w:color w:val="000000"/>
-        <w:kern w:val="0"/>
-        <w:sz w:val="24"/>
-        <w:szCs w:val="24"/>
-        <w:lang w:val="en-AU"/>
-        <w14:ligatures w14:val="none"/>
-      </w:rPr>
-      <w:t>N</w:t>
-    </w:r>
-    <w:r>
-      <w:rPr>
-        <w:rFonts w:ascii="Times New Roman" w:eastAsia="Times New Roman" w:hAnsi="Times New Roman" w:cs="Times New Roman"/>
-        <w:color w:val="000000"/>
-        <w:kern w:val="0"/>
-        <w:sz w:val="24"/>
-        <w:szCs w:val="24"/>
-        <w:lang w:val="en-AU"/>
-        <w14:ligatures w14:val="none"/>
-      </w:rPr>
-      <w:t>ame</w:t>
+      <w:t>courseName</w:t>
     </w:r>
     <w:proofErr w:type="spellEnd"/>
-    <w:r>
-      <w:rPr>
-        <w:rFonts w:ascii="Times New Roman" w:eastAsia="Times New Roman" w:hAnsi="Times New Roman" w:cs="Times New Roman"/>
-        <w:color w:val="000000"/>
-        <w:kern w:val="0"/>
-        <w:sz w:val="24"/>
-        <w:szCs w:val="24"/>
-        <w:lang w:val="en-AU"/>
-        <w14:ligatures w14:val="none"/>
-      </w:rPr>
-      <w:t>}</w:t>
-    </w:r>
   </w:p>
   <w:p>
     <w:pPr>

</xml_diff>